<commit_message>
feat(template): rebuild working-group-list DOCX with styled table layout
Replace plain-text pipe-separated layout with professional DOCX:
- Teal header badge, Georgia title, styled 4-column table
- Footer with CC0 1.0 attribution and page numbers
- Generator script matching closing-checklist pattern
- Integration test updated for table-based assertions
</commit_message>
<xml_diff>
--- a/content/templates/working-group-list/template.docx
+++ b/content/templates/working-group-list/template.docx
@@ -4,41 +4,599 @@
   <w:body>
     <w:p>
       <w:pPr>
-        <w:pStyle w:val="Heading1"/>
+        <w:spacing w:before="240" w:after="210"/>
       </w:pPr>
       <w:r>
-        <w:t xml:space="preserve">{deal_name} - Working Group List</w:t>
+        <w:rPr>
+          <w:rFonts w:ascii="Georgia" w:cs="Georgia" w:eastAsia="Georgia" w:hAnsi="Georgia"/>
+          <w:color w:val="1D2021"/>
+          <w:sz w:val="44"/>
+          <w:szCs w:val="44"/>
+        </w:rPr>
+        <w:t xml:space="preserve">{deal_name} — Working Group List</w:t>
       </w:r>
     </w:p>
     <w:p>
+      <w:pPr>
+        <w:spacing w:before="0" w:after="300"/>
+      </w:pPr>
       <w:r>
+        <w:rPr>
+          <w:rFonts w:ascii="Arial" w:cs="Arial" w:eastAsia="Arial" w:hAnsi="Arial"/>
+          <w:i/>
+          <w:iCs/>
+          <w:color w:val="494A4B"/>
+          <w:sz w:val="20"/>
+          <w:szCs w:val="20"/>
+        </w:rPr>
         <w:t xml:space="preserve">Updated: {updated_at}</w:t>
       </w:r>
     </w:p>
-    <w:p/>
     <w:p>
+      <w:pPr>
+        <w:spacing w:before="0" w:after="240" w:line="340" w:beforeAutospacing="false" w:afterAutospacing="false"/>
+        <w:contextualSpacing w:val="false"/>
+      </w:pPr>
       <w:r>
-        <w:t xml:space="preserve">Name | Organization | Role | Email</w:t>
+        <w:rPr>
+          <w:rFonts w:ascii="Arial" w:cs="Arial" w:eastAsia="Arial" w:hAnsi="Arial"/>
+          <w:b/>
+          <w:bCs/>
+          <w:color w:val="117086"/>
+          <w:sz w:val="22"/>
+          <w:szCs w:val="22"/>
+        </w:rPr>
+        <w:t xml:space="preserve">Members</w:t>
       </w:r>
     </w:p>
-    <w:p>
-      <w:r>
-        <w:t xml:space="preserve">{FOR m IN working_group}</w:t>
-      </w:r>
-    </w:p>
-    <w:p>
-      <w:r>
-        <w:t xml:space="preserve">{$m.name} | {$m.organization} | {$m.role} | {$m.email}</w:t>
-      </w:r>
-    </w:p>
-    <w:p>
-      <w:r>
-        <w:t xml:space="preserve">{END-FOR m}</w:t>
-      </w:r>
-    </w:p>
+    <w:tbl>
+      <w:tblPr>
+        <w:tblW w:type="dxa" w:w="10070"/>
+        <w:tblBorders>
+          <w:top w:val="nil" w:color="FFFFFF" w:sz="0"/>
+          <w:left w:val="nil" w:color="FFFFFF" w:sz="0"/>
+          <w:bottom w:val="nil" w:color="FFFFFF" w:sz="0"/>
+          <w:right w:val="nil" w:color="FFFFFF" w:sz="0"/>
+          <w:insideH w:val="single" w:color="auto" w:sz="4"/>
+          <w:insideV w:val="single" w:color="auto" w:sz="4"/>
+        </w:tblBorders>
+        <w:tblLayout w:type="fixed"/>
+      </w:tblPr>
+      <w:tblGrid>
+        <w:gridCol w:w="2800"/>
+        <w:gridCol w:w="2800"/>
+        <w:gridCol w:w="2200"/>
+        <w:gridCol w:w="2270"/>
+      </w:tblGrid>
+      <w:tr>
+        <w:trPr>
+          <w:tblHeader/>
+          <w:trHeight w:val="500" w:hRule="atLeast"/>
+        </w:trPr>
+        <w:tc>
+          <w:tcPr>
+            <w:tcBorders>
+              <w:top w:val="single" w:color="C7C7C7" w:sz="4"/>
+              <w:left w:val="nil" w:color="FFFFFF" w:sz="0"/>
+              <w:bottom w:val="single" w:color="C7C7C7" w:sz="4"/>
+              <w:right w:val="nil" w:color="FFFFFF" w:sz="0"/>
+            </w:tcBorders>
+            <w:shd w:fill="F5F5F5" w:color="auto" w:val="clear"/>
+            <w:tcMar>
+              <w:top w:type="dxa" w:w="115"/>
+              <w:left w:type="dxa" w:w="115"/>
+              <w:bottom w:type="dxa" w:w="115"/>
+              <w:right w:type="dxa" w:w="115"/>
+            </w:tcMar>
+            <w:vAlign w:val="center"/>
+          </w:tcPr>
+          <w:p>
+            <w:pPr>
+              <w:spacing w:after="0" w:line="340"/>
+            </w:pPr>
+            <w:r>
+              <w:rPr>
+                <w:rFonts w:ascii="Arial" w:cs="Arial" w:eastAsia="Arial" w:hAnsi="Arial"/>
+                <w:b/>
+                <w:bCs/>
+                <w:color w:val="107087"/>
+                <w:sz w:val="20"/>
+                <w:szCs w:val="20"/>
+              </w:rPr>
+              <w:t xml:space="preserve">Name</w:t>
+            </w:r>
+          </w:p>
+        </w:tc>
+        <w:tc>
+          <w:tcPr>
+            <w:tcBorders>
+              <w:top w:val="single" w:color="C7C7C7" w:sz="4"/>
+              <w:left w:val="nil" w:color="FFFFFF" w:sz="0"/>
+              <w:bottom w:val="single" w:color="C7C7C7" w:sz="4"/>
+              <w:right w:val="nil" w:color="FFFFFF" w:sz="0"/>
+            </w:tcBorders>
+            <w:shd w:fill="F5F5F5" w:color="auto" w:val="clear"/>
+            <w:tcMar>
+              <w:top w:type="dxa" w:w="115"/>
+              <w:left w:type="dxa" w:w="115"/>
+              <w:bottom w:type="dxa" w:w="115"/>
+              <w:right w:type="dxa" w:w="115"/>
+            </w:tcMar>
+            <w:vAlign w:val="center"/>
+          </w:tcPr>
+          <w:p>
+            <w:pPr>
+              <w:spacing w:after="0" w:line="340"/>
+            </w:pPr>
+            <w:r>
+              <w:rPr>
+                <w:rFonts w:ascii="Arial" w:cs="Arial" w:eastAsia="Arial" w:hAnsi="Arial"/>
+                <w:b/>
+                <w:bCs/>
+                <w:color w:val="107087"/>
+                <w:sz w:val="20"/>
+                <w:szCs w:val="20"/>
+              </w:rPr>
+              <w:t xml:space="preserve">Organization</w:t>
+            </w:r>
+          </w:p>
+        </w:tc>
+        <w:tc>
+          <w:tcPr>
+            <w:tcBorders>
+              <w:top w:val="single" w:color="C7C7C7" w:sz="4"/>
+              <w:left w:val="nil" w:color="FFFFFF" w:sz="0"/>
+              <w:bottom w:val="single" w:color="C7C7C7" w:sz="4"/>
+              <w:right w:val="nil" w:color="FFFFFF" w:sz="0"/>
+            </w:tcBorders>
+            <w:shd w:fill="F5F5F5" w:color="auto" w:val="clear"/>
+            <w:tcMar>
+              <w:top w:type="dxa" w:w="115"/>
+              <w:left w:type="dxa" w:w="115"/>
+              <w:bottom w:type="dxa" w:w="115"/>
+              <w:right w:type="dxa" w:w="115"/>
+            </w:tcMar>
+            <w:vAlign w:val="center"/>
+          </w:tcPr>
+          <w:p>
+            <w:pPr>
+              <w:spacing w:after="0" w:line="340"/>
+            </w:pPr>
+            <w:r>
+              <w:rPr>
+                <w:rFonts w:ascii="Arial" w:cs="Arial" w:eastAsia="Arial" w:hAnsi="Arial"/>
+                <w:b/>
+                <w:bCs/>
+                <w:color w:val="107087"/>
+                <w:sz w:val="20"/>
+                <w:szCs w:val="20"/>
+              </w:rPr>
+              <w:t xml:space="preserve">Role</w:t>
+            </w:r>
+          </w:p>
+        </w:tc>
+        <w:tc>
+          <w:tcPr>
+            <w:tcBorders>
+              <w:top w:val="single" w:color="C7C7C7" w:sz="4"/>
+              <w:left w:val="nil" w:color="FFFFFF" w:sz="0"/>
+              <w:bottom w:val="single" w:color="C7C7C7" w:sz="4"/>
+              <w:right w:val="nil" w:color="FFFFFF" w:sz="0"/>
+            </w:tcBorders>
+            <w:shd w:fill="F5F5F5" w:color="auto" w:val="clear"/>
+            <w:tcMar>
+              <w:top w:type="dxa" w:w="115"/>
+              <w:left w:type="dxa" w:w="115"/>
+              <w:bottom w:type="dxa" w:w="115"/>
+              <w:right w:type="dxa" w:w="115"/>
+            </w:tcMar>
+            <w:vAlign w:val="center"/>
+          </w:tcPr>
+          <w:p>
+            <w:pPr>
+              <w:spacing w:after="0" w:line="340"/>
+            </w:pPr>
+            <w:r>
+              <w:rPr>
+                <w:rFonts w:ascii="Arial" w:cs="Arial" w:eastAsia="Arial" w:hAnsi="Arial"/>
+                <w:b/>
+                <w:bCs/>
+                <w:color w:val="107087"/>
+                <w:sz w:val="20"/>
+                <w:szCs w:val="20"/>
+              </w:rPr>
+              <w:t xml:space="preserve">Email</w:t>
+            </w:r>
+          </w:p>
+        </w:tc>
+      </w:tr>
+      <w:tr>
+        <w:trPr>
+          <w:trHeight w:val="0" w:hRule="atLeast"/>
+        </w:trPr>
+        <w:tc>
+          <w:tcPr>
+            <w:tcBorders>
+              <w:top w:val="single" w:color="C7C7C7" w:sz="4"/>
+              <w:left w:val="nil" w:color="FFFFFF" w:sz="0"/>
+              <w:bottom w:val="single" w:color="C7C7C7" w:sz="4"/>
+              <w:right w:val="nil" w:color="FFFFFF" w:sz="0"/>
+            </w:tcBorders>
+            <w:tcMar>
+              <w:top w:type="dxa" w:w="115"/>
+              <w:left w:type="dxa" w:w="115"/>
+              <w:bottom w:type="dxa" w:w="115"/>
+              <w:right w:type="dxa" w:w="115"/>
+            </w:tcMar>
+            <w:vAlign w:val="center"/>
+          </w:tcPr>
+          <w:p>
+            <w:pPr>
+              <w:spacing w:after="0" w:line="340"/>
+            </w:pPr>
+            <w:r>
+              <w:rPr>
+                <w:rFonts w:ascii="Arial" w:cs="Arial" w:eastAsia="Arial" w:hAnsi="Arial"/>
+                <w:color w:val="1D2021"/>
+                <w:sz w:val="2"/>
+                <w:szCs w:val="2"/>
+              </w:rPr>
+              <w:t xml:space="preserve">{FOR m IN working_group}</w:t>
+            </w:r>
+          </w:p>
+        </w:tc>
+        <w:tc>
+          <w:tcPr>
+            <w:tcBorders>
+              <w:top w:val="single" w:color="C7C7C7" w:sz="4"/>
+              <w:left w:val="nil" w:color="FFFFFF" w:sz="0"/>
+              <w:bottom w:val="single" w:color="C7C7C7" w:sz="4"/>
+              <w:right w:val="nil" w:color="FFFFFF" w:sz="0"/>
+            </w:tcBorders>
+            <w:tcMar>
+              <w:top w:type="dxa" w:w="115"/>
+              <w:left w:type="dxa" w:w="115"/>
+              <w:bottom w:type="dxa" w:w="115"/>
+              <w:right w:type="dxa" w:w="115"/>
+            </w:tcMar>
+            <w:vAlign w:val="center"/>
+          </w:tcPr>
+          <w:p>
+            <w:pPr>
+              <w:spacing w:after="0" w:line="340"/>
+            </w:pPr>
+            <w:r>
+              <w:rPr>
+                <w:rFonts w:ascii="Arial" w:cs="Arial" w:eastAsia="Arial" w:hAnsi="Arial"/>
+                <w:sz w:val="2"/>
+                <w:szCs w:val="2"/>
+              </w:rPr>
+              <w:t xml:space="preserve"/>
+            </w:r>
+          </w:p>
+        </w:tc>
+        <w:tc>
+          <w:tcPr>
+            <w:tcBorders>
+              <w:top w:val="single" w:color="C7C7C7" w:sz="4"/>
+              <w:left w:val="nil" w:color="FFFFFF" w:sz="0"/>
+              <w:bottom w:val="single" w:color="C7C7C7" w:sz="4"/>
+              <w:right w:val="nil" w:color="FFFFFF" w:sz="0"/>
+            </w:tcBorders>
+            <w:tcMar>
+              <w:top w:type="dxa" w:w="115"/>
+              <w:left w:type="dxa" w:w="115"/>
+              <w:bottom w:type="dxa" w:w="115"/>
+              <w:right w:type="dxa" w:w="115"/>
+            </w:tcMar>
+            <w:vAlign w:val="center"/>
+          </w:tcPr>
+          <w:p>
+            <w:pPr>
+              <w:spacing w:after="0" w:line="340"/>
+            </w:pPr>
+            <w:r>
+              <w:rPr>
+                <w:rFonts w:ascii="Arial" w:cs="Arial" w:eastAsia="Arial" w:hAnsi="Arial"/>
+                <w:sz w:val="2"/>
+                <w:szCs w:val="2"/>
+              </w:rPr>
+              <w:t xml:space="preserve"/>
+            </w:r>
+          </w:p>
+        </w:tc>
+        <w:tc>
+          <w:tcPr>
+            <w:tcBorders>
+              <w:top w:val="single" w:color="C7C7C7" w:sz="4"/>
+              <w:left w:val="nil" w:color="FFFFFF" w:sz="0"/>
+              <w:bottom w:val="single" w:color="C7C7C7" w:sz="4"/>
+              <w:right w:val="nil" w:color="FFFFFF" w:sz="0"/>
+            </w:tcBorders>
+            <w:tcMar>
+              <w:top w:type="dxa" w:w="115"/>
+              <w:left w:type="dxa" w:w="115"/>
+              <w:bottom w:type="dxa" w:w="115"/>
+              <w:right w:type="dxa" w:w="115"/>
+            </w:tcMar>
+            <w:vAlign w:val="center"/>
+          </w:tcPr>
+          <w:p>
+            <w:pPr>
+              <w:spacing w:after="0" w:line="340"/>
+            </w:pPr>
+            <w:r>
+              <w:rPr>
+                <w:rFonts w:ascii="Arial" w:cs="Arial" w:eastAsia="Arial" w:hAnsi="Arial"/>
+                <w:sz w:val="2"/>
+                <w:szCs w:val="2"/>
+              </w:rPr>
+              <w:t xml:space="preserve"/>
+            </w:r>
+          </w:p>
+        </w:tc>
+      </w:tr>
+      <w:tr>
+        <w:trPr>
+          <w:trHeight w:val="500" w:hRule="atLeast"/>
+        </w:trPr>
+        <w:tc>
+          <w:tcPr>
+            <w:tcBorders>
+              <w:top w:val="single" w:color="C7C7C7" w:sz="4"/>
+              <w:left w:val="nil" w:color="FFFFFF" w:sz="0"/>
+              <w:bottom w:val="single" w:color="C7C7C7" w:sz="4"/>
+              <w:right w:val="nil" w:color="FFFFFF" w:sz="0"/>
+            </w:tcBorders>
+            <w:tcMar>
+              <w:top w:type="dxa" w:w="115"/>
+              <w:left w:type="dxa" w:w="115"/>
+              <w:bottom w:type="dxa" w:w="115"/>
+              <w:right w:type="dxa" w:w="115"/>
+            </w:tcMar>
+            <w:vAlign w:val="center"/>
+          </w:tcPr>
+          <w:p>
+            <w:pPr>
+              <w:spacing w:after="0" w:line="340"/>
+            </w:pPr>
+            <w:r>
+              <w:rPr>
+                <w:rFonts w:ascii="Arial" w:cs="Arial" w:eastAsia="Arial" w:hAnsi="Arial"/>
+                <w:color w:val="1D2021"/>
+                <w:sz w:val="20"/>
+                <w:szCs w:val="20"/>
+              </w:rPr>
+              <w:t xml:space="preserve">{$m.name}</w:t>
+            </w:r>
+          </w:p>
+        </w:tc>
+        <w:tc>
+          <w:tcPr>
+            <w:tcBorders>
+              <w:top w:val="single" w:color="C7C7C7" w:sz="4"/>
+              <w:left w:val="nil" w:color="FFFFFF" w:sz="0"/>
+              <w:bottom w:val="single" w:color="C7C7C7" w:sz="4"/>
+              <w:right w:val="nil" w:color="FFFFFF" w:sz="0"/>
+            </w:tcBorders>
+            <w:tcMar>
+              <w:top w:type="dxa" w:w="115"/>
+              <w:left w:type="dxa" w:w="115"/>
+              <w:bottom w:type="dxa" w:w="115"/>
+              <w:right w:type="dxa" w:w="115"/>
+            </w:tcMar>
+            <w:vAlign w:val="center"/>
+          </w:tcPr>
+          <w:p>
+            <w:pPr>
+              <w:spacing w:after="0" w:line="340"/>
+            </w:pPr>
+            <w:r>
+              <w:rPr>
+                <w:rFonts w:ascii="Arial" w:cs="Arial" w:eastAsia="Arial" w:hAnsi="Arial"/>
+                <w:color w:val="1D2021"/>
+                <w:sz w:val="20"/>
+                <w:szCs w:val="20"/>
+              </w:rPr>
+              <w:t xml:space="preserve">{$m.organization}</w:t>
+            </w:r>
+          </w:p>
+        </w:tc>
+        <w:tc>
+          <w:tcPr>
+            <w:tcBorders>
+              <w:top w:val="single" w:color="C7C7C7" w:sz="4"/>
+              <w:left w:val="nil" w:color="FFFFFF" w:sz="0"/>
+              <w:bottom w:val="single" w:color="C7C7C7" w:sz="4"/>
+              <w:right w:val="nil" w:color="FFFFFF" w:sz="0"/>
+            </w:tcBorders>
+            <w:tcMar>
+              <w:top w:type="dxa" w:w="115"/>
+              <w:left w:type="dxa" w:w="115"/>
+              <w:bottom w:type="dxa" w:w="115"/>
+              <w:right w:type="dxa" w:w="115"/>
+            </w:tcMar>
+            <w:vAlign w:val="center"/>
+          </w:tcPr>
+          <w:p>
+            <w:pPr>
+              <w:spacing w:after="0" w:line="340"/>
+            </w:pPr>
+            <w:r>
+              <w:rPr>
+                <w:rFonts w:ascii="Arial" w:cs="Arial" w:eastAsia="Arial" w:hAnsi="Arial"/>
+                <w:color w:val="1D2021"/>
+                <w:sz w:val="20"/>
+                <w:szCs w:val="20"/>
+              </w:rPr>
+              <w:t xml:space="preserve">{$m.role}</w:t>
+            </w:r>
+          </w:p>
+        </w:tc>
+        <w:tc>
+          <w:tcPr>
+            <w:tcBorders>
+              <w:top w:val="single" w:color="C7C7C7" w:sz="4"/>
+              <w:left w:val="nil" w:color="FFFFFF" w:sz="0"/>
+              <w:bottom w:val="single" w:color="C7C7C7" w:sz="4"/>
+              <w:right w:val="nil" w:color="FFFFFF" w:sz="0"/>
+            </w:tcBorders>
+            <w:tcMar>
+              <w:top w:type="dxa" w:w="115"/>
+              <w:left w:type="dxa" w:w="115"/>
+              <w:bottom w:type="dxa" w:w="115"/>
+              <w:right w:type="dxa" w:w="115"/>
+            </w:tcMar>
+            <w:vAlign w:val="center"/>
+          </w:tcPr>
+          <w:p>
+            <w:pPr>
+              <w:spacing w:after="0" w:line="340"/>
+            </w:pPr>
+            <w:r>
+              <w:rPr>
+                <w:rFonts w:ascii="Arial" w:cs="Arial" w:eastAsia="Arial" w:hAnsi="Arial"/>
+                <w:color w:val="1D2021"/>
+                <w:sz w:val="20"/>
+                <w:szCs w:val="20"/>
+              </w:rPr>
+              <w:t xml:space="preserve">{$m.email}</w:t>
+            </w:r>
+          </w:p>
+        </w:tc>
+      </w:tr>
+      <w:tr>
+        <w:trPr>
+          <w:trHeight w:val="0" w:hRule="atLeast"/>
+        </w:trPr>
+        <w:tc>
+          <w:tcPr>
+            <w:tcBorders>
+              <w:top w:val="single" w:color="C7C7C7" w:sz="4"/>
+              <w:left w:val="nil" w:color="FFFFFF" w:sz="0"/>
+              <w:bottom w:val="single" w:color="C7C7C7" w:sz="4"/>
+              <w:right w:val="nil" w:color="FFFFFF" w:sz="0"/>
+            </w:tcBorders>
+            <w:tcMar>
+              <w:top w:type="dxa" w:w="115"/>
+              <w:left w:type="dxa" w:w="115"/>
+              <w:bottom w:type="dxa" w:w="115"/>
+              <w:right w:type="dxa" w:w="115"/>
+            </w:tcMar>
+            <w:vAlign w:val="center"/>
+          </w:tcPr>
+          <w:p>
+            <w:pPr>
+              <w:spacing w:after="0" w:line="340"/>
+            </w:pPr>
+            <w:r>
+              <w:rPr>
+                <w:rFonts w:ascii="Arial" w:cs="Arial" w:eastAsia="Arial" w:hAnsi="Arial"/>
+                <w:color w:val="1D2021"/>
+                <w:sz w:val="2"/>
+                <w:szCs w:val="2"/>
+              </w:rPr>
+              <w:t xml:space="preserve">{END-FOR m}</w:t>
+            </w:r>
+          </w:p>
+        </w:tc>
+        <w:tc>
+          <w:tcPr>
+            <w:tcBorders>
+              <w:top w:val="single" w:color="C7C7C7" w:sz="4"/>
+              <w:left w:val="nil" w:color="FFFFFF" w:sz="0"/>
+              <w:bottom w:val="single" w:color="C7C7C7" w:sz="4"/>
+              <w:right w:val="nil" w:color="FFFFFF" w:sz="0"/>
+            </w:tcBorders>
+            <w:tcMar>
+              <w:top w:type="dxa" w:w="115"/>
+              <w:left w:type="dxa" w:w="115"/>
+              <w:bottom w:type="dxa" w:w="115"/>
+              <w:right w:type="dxa" w:w="115"/>
+            </w:tcMar>
+            <w:vAlign w:val="center"/>
+          </w:tcPr>
+          <w:p>
+            <w:pPr>
+              <w:spacing w:after="0" w:line="340"/>
+            </w:pPr>
+            <w:r>
+              <w:rPr>
+                <w:rFonts w:ascii="Arial" w:cs="Arial" w:eastAsia="Arial" w:hAnsi="Arial"/>
+                <w:sz w:val="2"/>
+                <w:szCs w:val="2"/>
+              </w:rPr>
+              <w:t xml:space="preserve"/>
+            </w:r>
+          </w:p>
+        </w:tc>
+        <w:tc>
+          <w:tcPr>
+            <w:tcBorders>
+              <w:top w:val="single" w:color="C7C7C7" w:sz="4"/>
+              <w:left w:val="nil" w:color="FFFFFF" w:sz="0"/>
+              <w:bottom w:val="single" w:color="C7C7C7" w:sz="4"/>
+              <w:right w:val="nil" w:color="FFFFFF" w:sz="0"/>
+            </w:tcBorders>
+            <w:tcMar>
+              <w:top w:type="dxa" w:w="115"/>
+              <w:left w:type="dxa" w:w="115"/>
+              <w:bottom w:type="dxa" w:w="115"/>
+              <w:right w:type="dxa" w:w="115"/>
+            </w:tcMar>
+            <w:vAlign w:val="center"/>
+          </w:tcPr>
+          <w:p>
+            <w:pPr>
+              <w:spacing w:after="0" w:line="340"/>
+            </w:pPr>
+            <w:r>
+              <w:rPr>
+                <w:rFonts w:ascii="Arial" w:cs="Arial" w:eastAsia="Arial" w:hAnsi="Arial"/>
+                <w:sz w:val="2"/>
+                <w:szCs w:val="2"/>
+              </w:rPr>
+              <w:t xml:space="preserve"/>
+            </w:r>
+          </w:p>
+        </w:tc>
+        <w:tc>
+          <w:tcPr>
+            <w:tcBorders>
+              <w:top w:val="single" w:color="C7C7C7" w:sz="4"/>
+              <w:left w:val="nil" w:color="FFFFFF" w:sz="0"/>
+              <w:bottom w:val="single" w:color="C7C7C7" w:sz="4"/>
+              <w:right w:val="nil" w:color="FFFFFF" w:sz="0"/>
+            </w:tcBorders>
+            <w:tcMar>
+              <w:top w:type="dxa" w:w="115"/>
+              <w:left w:type="dxa" w:w="115"/>
+              <w:bottom w:type="dxa" w:w="115"/>
+              <w:right w:type="dxa" w:w="115"/>
+            </w:tcMar>
+            <w:vAlign w:val="center"/>
+          </w:tcPr>
+          <w:p>
+            <w:pPr>
+              <w:spacing w:after="0" w:line="340"/>
+            </w:pPr>
+            <w:r>
+              <w:rPr>
+                <w:rFonts w:ascii="Arial" w:cs="Arial" w:eastAsia="Arial" w:hAnsi="Arial"/>
+                <w:sz w:val="2"/>
+                <w:szCs w:val="2"/>
+              </w:rPr>
+              <w:t xml:space="preserve"/>
+            </w:r>
+          </w:p>
+        </w:tc>
+      </w:tr>
+    </w:tbl>
     <w:sectPr>
+      <w:headerReference w:type="default" r:id="rId6"/>
+      <w:footerReference w:type="default" r:id="rId7"/>
       <w:pgSz w:w="11906" w:h="16838" w:orient="portrait"/>
-      <w:pgMar w:top="1440" w:right="1440" w:bottom="1440" w:left="1440" w:header="708" w:footer="708" w:gutter="0"/>
+      <w:pgMar w:top="936" w:right="1080" w:bottom="720" w:left="1080" w:header="360" w:footer="432" w:gutter="0"/>
       <w:pgNumType/>
       <w:docGrid w:linePitch="360"/>
     </w:sectPr>
@@ -48,6 +606,69 @@
 
 <file path=word/comments.xml><?xml version="1.0" encoding="utf-8"?>
 <w:comments xmlns:cx="http://schemas.microsoft.com/office/drawing/2014/chartex" xmlns:cx1="http://schemas.microsoft.com/office/drawing/2015/9/8/chartex" xmlns:cx2="http://schemas.microsoft.com/office/drawing/2015/10/21/chartex" xmlns:cx3="http://schemas.microsoft.com/office/drawing/2016/5/9/chartex" xmlns:cx4="http://schemas.microsoft.com/office/drawing/2016/5/10/chartex" xmlns:cx5="http://schemas.microsoft.com/office/drawing/2016/5/11/chartex" xmlns:cx6="http://schemas.microsoft.com/office/drawing/2016/5/12/chartex" xmlns:cx7="http://schemas.microsoft.com/office/drawing/2016/5/13/chartex" xmlns:cx8="http://schemas.microsoft.com/office/drawing/2016/5/14/chartex" xmlns:mc="http://schemas.openxmlformats.org/markup-compatibility/2006" xmlns:aink="http://schemas.microsoft.com/office/drawing/2016/ink" xmlns:am3d="http://schemas.microsoft.com/office/drawing/2017/model3d" xmlns:o="urn:schemas-microsoft-com:office:office" xmlns:r="http://schemas.openxmlformats.org/officeDocument/2006/relationships" xmlns:m="http://schemas.openxmlformats.org/officeDocument/2006/math" xmlns:v="urn:schemas-microsoft-com:vml" xmlns:wp14="http://schemas.microsoft.com/office/word/2010/wordprocessingDrawing" xmlns:wp="http://schemas.openxmlformats.org/drawingml/2006/wordprocessingDrawing" xmlns:w10="urn:schemas-microsoft-com:office:word" xmlns:w="http://schemas.openxmlformats.org/wordprocessingml/2006/main" xmlns:w14="http://schemas.microsoft.com/office/word/2010/wordml" xmlns:w15="http://schemas.microsoft.com/office/word/2012/wordml" xmlns:w16cex="http://schemas.microsoft.com/office/word/2018/wordml/cex" xmlns:w16cid="http://schemas.microsoft.com/office/word/2016/wordml/cid" xmlns:w16="http://schemas.microsoft.com/office/word/2018/wordml" xmlns:w16sdtdh="http://schemas.microsoft.com/office/word/2020/wordml/sdtdatahash" xmlns:w16se="http://schemas.microsoft.com/office/word/2015/wordml/symex" xmlns:wpg="http://schemas.microsoft.com/office/word/2010/wordprocessingGroup" xmlns:wpi="http://schemas.microsoft.com/office/word/2010/wordprocessingInk" xmlns:wne="http://schemas.microsoft.com/office/word/2006/wordml" xmlns:wps="http://schemas.microsoft.com/office/word/2010/wordprocessingShape"/>
+</file>
+
+<file path=word/footer1.xml><?xml version="1.0" encoding="utf-8"?>
+<w:ftr xmlns:wpc="http://schemas.microsoft.com/office/word/2010/wordprocessingCanvas" xmlns:mc="http://schemas.openxmlformats.org/markup-compatibility/2006" xmlns:o="urn:schemas-microsoft-com:office:office" xmlns:r="http://schemas.openxmlformats.org/officeDocument/2006/relationships" xmlns:m="http://schemas.openxmlformats.org/officeDocument/2006/math" xmlns:v="urn:schemas-microsoft-com:vml" xmlns:wp14="http://schemas.microsoft.com/office/word/2010/wordprocessingDrawing" xmlns:wp="http://schemas.openxmlformats.org/drawingml/2006/wordprocessingDrawing" xmlns:w10="urn:schemas-microsoft-com:office:word" xmlns:w="http://schemas.openxmlformats.org/wordprocessingml/2006/main" xmlns:w14="http://schemas.microsoft.com/office/word/2010/wordml" xmlns:w15="http://schemas.microsoft.com/office/word/2012/wordml" xmlns:wpg="http://schemas.microsoft.com/office/word/2010/wordprocessingGroup" xmlns:wpi="http://schemas.microsoft.com/office/word/2010/wordprocessingInk" xmlns:wne="http://schemas.microsoft.com/office/word/2006/wordml" xmlns:wps="http://schemas.microsoft.com/office/word/2010/wordprocessingShape">
+  <w:p>
+    <w:pPr>
+      <w:tabs>
+        <w:tab w:val="right" w:pos="9026"/>
+      </w:tabs>
+    </w:pPr>
+    <w:r>
+      <w:rPr>
+        <w:rFonts w:ascii="Arial" w:cs="Arial" w:eastAsia="Arial" w:hAnsi="Arial"/>
+        <w:color w:val="494A4B"/>
+        <w:sz w:val="13"/>
+        <w:szCs w:val="13"/>
+      </w:rPr>
+      <w:t xml:space="preserve">OpenAgreements Working Group List (v1.0). Free to use under CC0 1.0.</w:t>
+    </w:r>
+    <w:r>
+      <w:rPr>
+        <w:rFonts w:ascii="Arial" w:cs="Arial" w:eastAsia="Arial" w:hAnsi="Arial"/>
+        <w:color w:val="494A4B"/>
+        <w:sz w:val="13"/>
+        <w:szCs w:val="13"/>
+      </w:rPr>
+      <w:t xml:space="preserve">	Page </w:t>
+    </w:r>
+    <w:r>
+      <w:rPr>
+        <w:rFonts w:ascii="Arial" w:cs="Arial" w:eastAsia="Arial" w:hAnsi="Arial"/>
+        <w:color w:val="494A4B"/>
+        <w:sz w:val="13"/>
+        <w:szCs w:val="13"/>
+      </w:rPr>
+      <w:fldChar w:fldCharType="begin"/>
+      <w:instrText xml:space="preserve">PAGE</w:instrText>
+      <w:fldChar w:fldCharType="separate"/>
+      <w:fldChar w:fldCharType="end"/>
+    </w:r>
+    <w:r>
+      <w:rPr>
+        <w:rFonts w:ascii="Arial" w:cs="Arial" w:eastAsia="Arial" w:hAnsi="Arial"/>
+        <w:color w:val="494A4B"/>
+        <w:sz w:val="13"/>
+        <w:szCs w:val="13"/>
+      </w:rPr>
+      <w:t xml:space="preserve"> of </w:t>
+    </w:r>
+    <w:r>
+      <w:rPr>
+        <w:rFonts w:ascii="Arial" w:cs="Arial" w:eastAsia="Arial" w:hAnsi="Arial"/>
+        <w:color w:val="494A4B"/>
+        <w:sz w:val="13"/>
+        <w:szCs w:val="13"/>
+      </w:rPr>
+      <w:fldChar w:fldCharType="begin"/>
+      <w:instrText xml:space="preserve">NUMPAGES</w:instrText>
+      <w:fldChar w:fldCharType="separate"/>
+      <w:fldChar w:fldCharType="end"/>
+    </w:r>
+  </w:p>
+</w:ftr>
 </file>
 
 <file path=word/footnotes.xml><?xml version="1.0" encoding="utf-8"?>
@@ -87,6 +708,97 @@
 </w:footnotes>
 </file>
 
+<file path=word/header1.xml><?xml version="1.0" encoding="utf-8"?>
+<w:hdr xmlns:wpc="http://schemas.microsoft.com/office/word/2010/wordprocessingCanvas" xmlns:mc="http://schemas.openxmlformats.org/markup-compatibility/2006" xmlns:o="urn:schemas-microsoft-com:office:office" xmlns:r="http://schemas.openxmlformats.org/officeDocument/2006/relationships" xmlns:m="http://schemas.openxmlformats.org/officeDocument/2006/math" xmlns:v="urn:schemas-microsoft-com:vml" xmlns:wp14="http://schemas.microsoft.com/office/word/2010/wordprocessingDrawing" xmlns:wp="http://schemas.openxmlformats.org/drawingml/2006/wordprocessingDrawing" xmlns:w10="urn:schemas-microsoft-com:office:word" xmlns:w="http://schemas.openxmlformats.org/wordprocessingml/2006/main" xmlns:w14="http://schemas.microsoft.com/office/word/2010/wordml" xmlns:w15="http://schemas.microsoft.com/office/word/2012/wordml" xmlns:wpg="http://schemas.microsoft.com/office/word/2010/wordprocessingGroup" xmlns:wpi="http://schemas.microsoft.com/office/word/2010/wordprocessingInk" xmlns:wne="http://schemas.microsoft.com/office/word/2006/wordml" xmlns:wps="http://schemas.microsoft.com/office/word/2010/wordprocessingShape" xmlns:cx="http://schemas.microsoft.com/office/drawing/2014/chartex" xmlns:cx1="http://schemas.microsoft.com/office/drawing/2015/9/8/chartex" xmlns:cx2="http://schemas.microsoft.com/office/drawing/2015/10/21/chartex" xmlns:cx3="http://schemas.microsoft.com/office/drawing/2016/5/9/chartex" xmlns:cx4="http://schemas.microsoft.com/office/drawing/2016/5/10/chartex" xmlns:cx5="http://schemas.microsoft.com/office/drawing/2016/5/11/chartex" xmlns:cx6="http://schemas.microsoft.com/office/drawing/2016/5/12/chartex" xmlns:cx7="http://schemas.microsoft.com/office/drawing/2016/5/13/chartex" xmlns:cx8="http://schemas.microsoft.com/office/drawing/2016/5/14/chartex" xmlns:w16cid="http://schemas.microsoft.com/office/word/2016/wordml/cid" xmlns:w16se="http://schemas.microsoft.com/office/word/2015/wordml/symex">
+  <w:tbl>
+    <w:tblPr>
+      <w:tblW w:type="dxa" w:w="10070"/>
+      <w:tblBorders>
+        <w:top w:val="single" w:color="107087" w:sz="14"/>
+        <w:left w:val="nil" w:color="FFFFFF" w:sz="0"/>
+        <w:bottom w:val="nil" w:color="FFFFFF" w:sz="0"/>
+        <w:right w:val="nil" w:color="FFFFFF" w:sz="0"/>
+        <w:insideH w:val="single" w:color="auto" w:sz="4"/>
+        <w:insideV w:val="single" w:color="auto" w:sz="4"/>
+      </w:tblBorders>
+      <w:tblLayout w:type="fixed"/>
+    </w:tblPr>
+    <w:tblGrid>
+      <w:gridCol w:w="7900"/>
+      <w:gridCol w:w="2170"/>
+    </w:tblGrid>
+    <w:tr>
+      <w:trPr>
+        <w:trHeight w:val="360" w:hRule="atLeast"/>
+      </w:trPr>
+      <w:tc>
+        <w:tcPr>
+          <w:tcBorders>
+            <w:top w:val="nil" w:color="FFFFFF" w:sz="0"/>
+            <w:left w:val="nil" w:color="FFFFFF" w:sz="0"/>
+            <w:bottom w:val="nil" w:color="FFFFFF" w:sz="0"/>
+            <w:right w:val="nil" w:color="FFFFFF" w:sz="0"/>
+          </w:tcBorders>
+          <w:tcMar>
+            <w:top w:type="dxa" w:w="36"/>
+            <w:left w:type="dxa" w:w="0"/>
+            <w:bottom w:type="dxa" w:w="0"/>
+            <w:right w:type="dxa" w:w="0"/>
+          </w:tcMar>
+        </w:tcPr>
+        <w:p>
+          <w:r>
+            <w:t xml:space="preserve"/>
+          </w:r>
+        </w:p>
+      </w:tc>
+      <w:tc>
+        <w:tcPr>
+          <w:tcBorders>
+            <w:top w:val="nil" w:color="FFFFFF" w:sz="0"/>
+            <w:left w:val="nil" w:color="FFFFFF" w:sz="0"/>
+            <w:bottom w:val="nil" w:color="FFFFFF" w:sz="0"/>
+            <w:right w:val="nil" w:color="FFFFFF" w:sz="0"/>
+          </w:tcBorders>
+          <w:tcMar>
+            <w:top w:type="dxa" w:w="36"/>
+            <w:left w:type="dxa" w:w="0"/>
+            <w:bottom w:type="dxa" w:w="0"/>
+            <w:right w:type="dxa" w:w="0"/>
+          </w:tcMar>
+          <w:vAlign w:val="center"/>
+        </w:tcPr>
+        <w:p>
+          <w:pPr>
+            <w:spacing w:before="0" w:after="0"/>
+            <w:jc w:val="right"/>
+          </w:pPr>
+          <w:r>
+            <w:rPr>
+              <w:rFonts w:ascii="Arial" w:cs="Arial" w:eastAsia="Arial" w:hAnsi="Arial"/>
+              <w:b/>
+              <w:bCs/>
+              <w:color w:val="107087"/>
+              <w:sz w:val="18"/>
+              <w:szCs w:val="18"/>
+            </w:rPr>
+            <w:t xml:space="preserve">WORKING GROUP LIST</w:t>
+          </w:r>
+        </w:p>
+      </w:tc>
+    </w:tr>
+  </w:tbl>
+  <w:p>
+    <w:pPr>
+      <w:spacing w:after="60"/>
+    </w:pPr>
+    <w:r>
+      <w:t xml:space="preserve"/>
+    </w:r>
+  </w:p>
+</w:hdr>
+</file>
+
 <file path=word/numbering.xml><?xml version="1.0" encoding="utf-8"?>
 <w:numbering xmlns:wpc="http://schemas.microsoft.com/office/word/2010/wordprocessingCanvas" xmlns:mc="http://schemas.openxmlformats.org/markup-compatibility/2006" xmlns:o="urn:schemas-microsoft-com:office:office" xmlns:r="http://schemas.openxmlformats.org/officeDocument/2006/relationships" xmlns:m="http://schemas.openxmlformats.org/officeDocument/2006/math" xmlns:v="urn:schemas-microsoft-com:vml" xmlns:wp14="http://schemas.microsoft.com/office/word/2010/wordprocessingDrawing" xmlns:wp="http://schemas.openxmlformats.org/drawingml/2006/wordprocessingDrawing" xmlns:w10="urn:schemas-microsoft-com:office:word" xmlns:w="http://schemas.openxmlformats.org/wordprocessingml/2006/main" xmlns:w14="http://schemas.microsoft.com/office/word/2010/wordml" xmlns:w15="http://schemas.microsoft.com/office/word/2012/wordml" xmlns:wpg="http://schemas.microsoft.com/office/word/2010/wordprocessingGroup" xmlns:wpi="http://schemas.microsoft.com/office/word/2010/wordprocessingInk" xmlns:wne="http://schemas.microsoft.com/office/word/2006/wordml" xmlns:wps="http://schemas.microsoft.com/office/word/2010/wordprocessingShape" mc:Ignorable="w14 w15 wp14">
   <w:abstractNum w:abstractNumId="1" w15:restartNumberingAfterBreak="0">
@@ -185,8 +897,19 @@
 <file path=word/styles.xml><?xml version="1.0" encoding="utf-8"?>
 <w:styles xmlns:mc="http://schemas.openxmlformats.org/markup-compatibility/2006" xmlns:r="http://schemas.openxmlformats.org/officeDocument/2006/relationships" xmlns:w="http://schemas.openxmlformats.org/wordprocessingml/2006/main" xmlns:w14="http://schemas.microsoft.com/office/word/2010/wordml" xmlns:w15="http://schemas.microsoft.com/office/word/2012/wordml" mc:Ignorable="w14 w15">
   <w:docDefaults>
-    <w:rPrDefault/>
-    <w:pPrDefault/>
+    <w:rPrDefault>
+      <w:rPr>
+        <w:rFonts w:ascii="Arial" w:cs="Arial" w:eastAsia="Arial" w:hAnsi="Arial"/>
+        <w:color w:val="1D2021"/>
+        <w:sz w:val="22"/>
+        <w:szCs w:val="22"/>
+      </w:rPr>
+    </w:rPrDefault>
+    <w:pPrDefault>
+      <w:pPr>
+        <w:spacing w:before="0" w:after="0" w:line="340" w:lineRule="auto"/>
+      </w:pPr>
+    </w:pPrDefault>
   </w:docDefaults>
   <w:style w:type="paragraph" w:styleId="Title">
     <w:name w:val="Title"/>
@@ -322,5 +1045,19 @@
       <w:szCs w:val="20"/>
     </w:rPr>
   </w:style>
+  <w:style w:type="paragraph" w:styleId="Normal">
+    <w:name w:val="Normal"/>
+    <w:next w:val="Normal"/>
+    <w:qFormat/>
+    <w:pPr>
+      <w:spacing w:before="0" w:after="0" w:line="340" w:lineRule="auto"/>
+    </w:pPr>
+    <w:rPr>
+      <w:rFonts w:ascii="Arial" w:cs="Arial" w:eastAsia="Arial" w:hAnsi="Arial"/>
+      <w:color w:val="1D2021"/>
+      <w:sz w:val="22"/>
+      <w:szCs w:val="22"/>
+    </w:rPr>
+  </w:style>
 </w:styles>
 </file>
</xml_diff>

<commit_message>
feat(template): rebuild working-group-list DOCX with styled table layout (#77)
* feat(template): rebuild working-group-list DOCX with styled table layout

Replace plain-text pipe-separated layout with professional DOCX:
- Teal header badge, Georgia title, styled 4-column table
- Footer with CC0 1.0 attribution and page numbers
- Generator script matching closing-checklist pattern
- Integration test updated for table-based assertions

* docs: add filled working group list screenshot for PR review
</commit_message>
<xml_diff>
--- a/content/templates/working-group-list/template.docx
+++ b/content/templates/working-group-list/template.docx
@@ -4,41 +4,599 @@
   <w:body>
     <w:p>
       <w:pPr>
-        <w:pStyle w:val="Heading1"/>
+        <w:spacing w:before="240" w:after="210"/>
       </w:pPr>
       <w:r>
-        <w:t xml:space="preserve">{deal_name} - Working Group List</w:t>
+        <w:rPr>
+          <w:rFonts w:ascii="Georgia" w:cs="Georgia" w:eastAsia="Georgia" w:hAnsi="Georgia"/>
+          <w:color w:val="1D2021"/>
+          <w:sz w:val="44"/>
+          <w:szCs w:val="44"/>
+        </w:rPr>
+        <w:t xml:space="preserve">{deal_name} — Working Group List</w:t>
       </w:r>
     </w:p>
     <w:p>
+      <w:pPr>
+        <w:spacing w:before="0" w:after="300"/>
+      </w:pPr>
       <w:r>
+        <w:rPr>
+          <w:rFonts w:ascii="Arial" w:cs="Arial" w:eastAsia="Arial" w:hAnsi="Arial"/>
+          <w:i/>
+          <w:iCs/>
+          <w:color w:val="494A4B"/>
+          <w:sz w:val="20"/>
+          <w:szCs w:val="20"/>
+        </w:rPr>
         <w:t xml:space="preserve">Updated: {updated_at}</w:t>
       </w:r>
     </w:p>
-    <w:p/>
     <w:p>
+      <w:pPr>
+        <w:spacing w:before="0" w:after="240" w:line="340" w:beforeAutospacing="false" w:afterAutospacing="false"/>
+        <w:contextualSpacing w:val="false"/>
+      </w:pPr>
       <w:r>
-        <w:t xml:space="preserve">Name | Organization | Role | Email</w:t>
+        <w:rPr>
+          <w:rFonts w:ascii="Arial" w:cs="Arial" w:eastAsia="Arial" w:hAnsi="Arial"/>
+          <w:b/>
+          <w:bCs/>
+          <w:color w:val="117086"/>
+          <w:sz w:val="22"/>
+          <w:szCs w:val="22"/>
+        </w:rPr>
+        <w:t xml:space="preserve">Members</w:t>
       </w:r>
     </w:p>
-    <w:p>
-      <w:r>
-        <w:t xml:space="preserve">{FOR m IN working_group}</w:t>
-      </w:r>
-    </w:p>
-    <w:p>
-      <w:r>
-        <w:t xml:space="preserve">{$m.name} | {$m.organization} | {$m.role} | {$m.email}</w:t>
-      </w:r>
-    </w:p>
-    <w:p>
-      <w:r>
-        <w:t xml:space="preserve">{END-FOR m}</w:t>
-      </w:r>
-    </w:p>
+    <w:tbl>
+      <w:tblPr>
+        <w:tblW w:type="dxa" w:w="10070"/>
+        <w:tblBorders>
+          <w:top w:val="nil" w:color="FFFFFF" w:sz="0"/>
+          <w:left w:val="nil" w:color="FFFFFF" w:sz="0"/>
+          <w:bottom w:val="nil" w:color="FFFFFF" w:sz="0"/>
+          <w:right w:val="nil" w:color="FFFFFF" w:sz="0"/>
+          <w:insideH w:val="single" w:color="auto" w:sz="4"/>
+          <w:insideV w:val="single" w:color="auto" w:sz="4"/>
+        </w:tblBorders>
+        <w:tblLayout w:type="fixed"/>
+      </w:tblPr>
+      <w:tblGrid>
+        <w:gridCol w:w="2800"/>
+        <w:gridCol w:w="2800"/>
+        <w:gridCol w:w="2200"/>
+        <w:gridCol w:w="2270"/>
+      </w:tblGrid>
+      <w:tr>
+        <w:trPr>
+          <w:tblHeader/>
+          <w:trHeight w:val="500" w:hRule="atLeast"/>
+        </w:trPr>
+        <w:tc>
+          <w:tcPr>
+            <w:tcBorders>
+              <w:top w:val="single" w:color="C7C7C7" w:sz="4"/>
+              <w:left w:val="nil" w:color="FFFFFF" w:sz="0"/>
+              <w:bottom w:val="single" w:color="C7C7C7" w:sz="4"/>
+              <w:right w:val="nil" w:color="FFFFFF" w:sz="0"/>
+            </w:tcBorders>
+            <w:shd w:fill="F5F5F5" w:color="auto" w:val="clear"/>
+            <w:tcMar>
+              <w:top w:type="dxa" w:w="115"/>
+              <w:left w:type="dxa" w:w="115"/>
+              <w:bottom w:type="dxa" w:w="115"/>
+              <w:right w:type="dxa" w:w="115"/>
+            </w:tcMar>
+            <w:vAlign w:val="center"/>
+          </w:tcPr>
+          <w:p>
+            <w:pPr>
+              <w:spacing w:after="0" w:line="340"/>
+            </w:pPr>
+            <w:r>
+              <w:rPr>
+                <w:rFonts w:ascii="Arial" w:cs="Arial" w:eastAsia="Arial" w:hAnsi="Arial"/>
+                <w:b/>
+                <w:bCs/>
+                <w:color w:val="107087"/>
+                <w:sz w:val="20"/>
+                <w:szCs w:val="20"/>
+              </w:rPr>
+              <w:t xml:space="preserve">Name</w:t>
+            </w:r>
+          </w:p>
+        </w:tc>
+        <w:tc>
+          <w:tcPr>
+            <w:tcBorders>
+              <w:top w:val="single" w:color="C7C7C7" w:sz="4"/>
+              <w:left w:val="nil" w:color="FFFFFF" w:sz="0"/>
+              <w:bottom w:val="single" w:color="C7C7C7" w:sz="4"/>
+              <w:right w:val="nil" w:color="FFFFFF" w:sz="0"/>
+            </w:tcBorders>
+            <w:shd w:fill="F5F5F5" w:color="auto" w:val="clear"/>
+            <w:tcMar>
+              <w:top w:type="dxa" w:w="115"/>
+              <w:left w:type="dxa" w:w="115"/>
+              <w:bottom w:type="dxa" w:w="115"/>
+              <w:right w:type="dxa" w:w="115"/>
+            </w:tcMar>
+            <w:vAlign w:val="center"/>
+          </w:tcPr>
+          <w:p>
+            <w:pPr>
+              <w:spacing w:after="0" w:line="340"/>
+            </w:pPr>
+            <w:r>
+              <w:rPr>
+                <w:rFonts w:ascii="Arial" w:cs="Arial" w:eastAsia="Arial" w:hAnsi="Arial"/>
+                <w:b/>
+                <w:bCs/>
+                <w:color w:val="107087"/>
+                <w:sz w:val="20"/>
+                <w:szCs w:val="20"/>
+              </w:rPr>
+              <w:t xml:space="preserve">Organization</w:t>
+            </w:r>
+          </w:p>
+        </w:tc>
+        <w:tc>
+          <w:tcPr>
+            <w:tcBorders>
+              <w:top w:val="single" w:color="C7C7C7" w:sz="4"/>
+              <w:left w:val="nil" w:color="FFFFFF" w:sz="0"/>
+              <w:bottom w:val="single" w:color="C7C7C7" w:sz="4"/>
+              <w:right w:val="nil" w:color="FFFFFF" w:sz="0"/>
+            </w:tcBorders>
+            <w:shd w:fill="F5F5F5" w:color="auto" w:val="clear"/>
+            <w:tcMar>
+              <w:top w:type="dxa" w:w="115"/>
+              <w:left w:type="dxa" w:w="115"/>
+              <w:bottom w:type="dxa" w:w="115"/>
+              <w:right w:type="dxa" w:w="115"/>
+            </w:tcMar>
+            <w:vAlign w:val="center"/>
+          </w:tcPr>
+          <w:p>
+            <w:pPr>
+              <w:spacing w:after="0" w:line="340"/>
+            </w:pPr>
+            <w:r>
+              <w:rPr>
+                <w:rFonts w:ascii="Arial" w:cs="Arial" w:eastAsia="Arial" w:hAnsi="Arial"/>
+                <w:b/>
+                <w:bCs/>
+                <w:color w:val="107087"/>
+                <w:sz w:val="20"/>
+                <w:szCs w:val="20"/>
+              </w:rPr>
+              <w:t xml:space="preserve">Role</w:t>
+            </w:r>
+          </w:p>
+        </w:tc>
+        <w:tc>
+          <w:tcPr>
+            <w:tcBorders>
+              <w:top w:val="single" w:color="C7C7C7" w:sz="4"/>
+              <w:left w:val="nil" w:color="FFFFFF" w:sz="0"/>
+              <w:bottom w:val="single" w:color="C7C7C7" w:sz="4"/>
+              <w:right w:val="nil" w:color="FFFFFF" w:sz="0"/>
+            </w:tcBorders>
+            <w:shd w:fill="F5F5F5" w:color="auto" w:val="clear"/>
+            <w:tcMar>
+              <w:top w:type="dxa" w:w="115"/>
+              <w:left w:type="dxa" w:w="115"/>
+              <w:bottom w:type="dxa" w:w="115"/>
+              <w:right w:type="dxa" w:w="115"/>
+            </w:tcMar>
+            <w:vAlign w:val="center"/>
+          </w:tcPr>
+          <w:p>
+            <w:pPr>
+              <w:spacing w:after="0" w:line="340"/>
+            </w:pPr>
+            <w:r>
+              <w:rPr>
+                <w:rFonts w:ascii="Arial" w:cs="Arial" w:eastAsia="Arial" w:hAnsi="Arial"/>
+                <w:b/>
+                <w:bCs/>
+                <w:color w:val="107087"/>
+                <w:sz w:val="20"/>
+                <w:szCs w:val="20"/>
+              </w:rPr>
+              <w:t xml:space="preserve">Email</w:t>
+            </w:r>
+          </w:p>
+        </w:tc>
+      </w:tr>
+      <w:tr>
+        <w:trPr>
+          <w:trHeight w:val="0" w:hRule="atLeast"/>
+        </w:trPr>
+        <w:tc>
+          <w:tcPr>
+            <w:tcBorders>
+              <w:top w:val="single" w:color="C7C7C7" w:sz="4"/>
+              <w:left w:val="nil" w:color="FFFFFF" w:sz="0"/>
+              <w:bottom w:val="single" w:color="C7C7C7" w:sz="4"/>
+              <w:right w:val="nil" w:color="FFFFFF" w:sz="0"/>
+            </w:tcBorders>
+            <w:tcMar>
+              <w:top w:type="dxa" w:w="115"/>
+              <w:left w:type="dxa" w:w="115"/>
+              <w:bottom w:type="dxa" w:w="115"/>
+              <w:right w:type="dxa" w:w="115"/>
+            </w:tcMar>
+            <w:vAlign w:val="center"/>
+          </w:tcPr>
+          <w:p>
+            <w:pPr>
+              <w:spacing w:after="0" w:line="340"/>
+            </w:pPr>
+            <w:r>
+              <w:rPr>
+                <w:rFonts w:ascii="Arial" w:cs="Arial" w:eastAsia="Arial" w:hAnsi="Arial"/>
+                <w:color w:val="1D2021"/>
+                <w:sz w:val="2"/>
+                <w:szCs w:val="2"/>
+              </w:rPr>
+              <w:t xml:space="preserve">{FOR m IN working_group}</w:t>
+            </w:r>
+          </w:p>
+        </w:tc>
+        <w:tc>
+          <w:tcPr>
+            <w:tcBorders>
+              <w:top w:val="single" w:color="C7C7C7" w:sz="4"/>
+              <w:left w:val="nil" w:color="FFFFFF" w:sz="0"/>
+              <w:bottom w:val="single" w:color="C7C7C7" w:sz="4"/>
+              <w:right w:val="nil" w:color="FFFFFF" w:sz="0"/>
+            </w:tcBorders>
+            <w:tcMar>
+              <w:top w:type="dxa" w:w="115"/>
+              <w:left w:type="dxa" w:w="115"/>
+              <w:bottom w:type="dxa" w:w="115"/>
+              <w:right w:type="dxa" w:w="115"/>
+            </w:tcMar>
+            <w:vAlign w:val="center"/>
+          </w:tcPr>
+          <w:p>
+            <w:pPr>
+              <w:spacing w:after="0" w:line="340"/>
+            </w:pPr>
+            <w:r>
+              <w:rPr>
+                <w:rFonts w:ascii="Arial" w:cs="Arial" w:eastAsia="Arial" w:hAnsi="Arial"/>
+                <w:sz w:val="2"/>
+                <w:szCs w:val="2"/>
+              </w:rPr>
+              <w:t xml:space="preserve"/>
+            </w:r>
+          </w:p>
+        </w:tc>
+        <w:tc>
+          <w:tcPr>
+            <w:tcBorders>
+              <w:top w:val="single" w:color="C7C7C7" w:sz="4"/>
+              <w:left w:val="nil" w:color="FFFFFF" w:sz="0"/>
+              <w:bottom w:val="single" w:color="C7C7C7" w:sz="4"/>
+              <w:right w:val="nil" w:color="FFFFFF" w:sz="0"/>
+            </w:tcBorders>
+            <w:tcMar>
+              <w:top w:type="dxa" w:w="115"/>
+              <w:left w:type="dxa" w:w="115"/>
+              <w:bottom w:type="dxa" w:w="115"/>
+              <w:right w:type="dxa" w:w="115"/>
+            </w:tcMar>
+            <w:vAlign w:val="center"/>
+          </w:tcPr>
+          <w:p>
+            <w:pPr>
+              <w:spacing w:after="0" w:line="340"/>
+            </w:pPr>
+            <w:r>
+              <w:rPr>
+                <w:rFonts w:ascii="Arial" w:cs="Arial" w:eastAsia="Arial" w:hAnsi="Arial"/>
+                <w:sz w:val="2"/>
+                <w:szCs w:val="2"/>
+              </w:rPr>
+              <w:t xml:space="preserve"/>
+            </w:r>
+          </w:p>
+        </w:tc>
+        <w:tc>
+          <w:tcPr>
+            <w:tcBorders>
+              <w:top w:val="single" w:color="C7C7C7" w:sz="4"/>
+              <w:left w:val="nil" w:color="FFFFFF" w:sz="0"/>
+              <w:bottom w:val="single" w:color="C7C7C7" w:sz="4"/>
+              <w:right w:val="nil" w:color="FFFFFF" w:sz="0"/>
+            </w:tcBorders>
+            <w:tcMar>
+              <w:top w:type="dxa" w:w="115"/>
+              <w:left w:type="dxa" w:w="115"/>
+              <w:bottom w:type="dxa" w:w="115"/>
+              <w:right w:type="dxa" w:w="115"/>
+            </w:tcMar>
+            <w:vAlign w:val="center"/>
+          </w:tcPr>
+          <w:p>
+            <w:pPr>
+              <w:spacing w:after="0" w:line="340"/>
+            </w:pPr>
+            <w:r>
+              <w:rPr>
+                <w:rFonts w:ascii="Arial" w:cs="Arial" w:eastAsia="Arial" w:hAnsi="Arial"/>
+                <w:sz w:val="2"/>
+                <w:szCs w:val="2"/>
+              </w:rPr>
+              <w:t xml:space="preserve"/>
+            </w:r>
+          </w:p>
+        </w:tc>
+      </w:tr>
+      <w:tr>
+        <w:trPr>
+          <w:trHeight w:val="500" w:hRule="atLeast"/>
+        </w:trPr>
+        <w:tc>
+          <w:tcPr>
+            <w:tcBorders>
+              <w:top w:val="single" w:color="C7C7C7" w:sz="4"/>
+              <w:left w:val="nil" w:color="FFFFFF" w:sz="0"/>
+              <w:bottom w:val="single" w:color="C7C7C7" w:sz="4"/>
+              <w:right w:val="nil" w:color="FFFFFF" w:sz="0"/>
+            </w:tcBorders>
+            <w:tcMar>
+              <w:top w:type="dxa" w:w="115"/>
+              <w:left w:type="dxa" w:w="115"/>
+              <w:bottom w:type="dxa" w:w="115"/>
+              <w:right w:type="dxa" w:w="115"/>
+            </w:tcMar>
+            <w:vAlign w:val="center"/>
+          </w:tcPr>
+          <w:p>
+            <w:pPr>
+              <w:spacing w:after="0" w:line="340"/>
+            </w:pPr>
+            <w:r>
+              <w:rPr>
+                <w:rFonts w:ascii="Arial" w:cs="Arial" w:eastAsia="Arial" w:hAnsi="Arial"/>
+                <w:color w:val="1D2021"/>
+                <w:sz w:val="20"/>
+                <w:szCs w:val="20"/>
+              </w:rPr>
+              <w:t xml:space="preserve">{$m.name}</w:t>
+            </w:r>
+          </w:p>
+        </w:tc>
+        <w:tc>
+          <w:tcPr>
+            <w:tcBorders>
+              <w:top w:val="single" w:color="C7C7C7" w:sz="4"/>
+              <w:left w:val="nil" w:color="FFFFFF" w:sz="0"/>
+              <w:bottom w:val="single" w:color="C7C7C7" w:sz="4"/>
+              <w:right w:val="nil" w:color="FFFFFF" w:sz="0"/>
+            </w:tcBorders>
+            <w:tcMar>
+              <w:top w:type="dxa" w:w="115"/>
+              <w:left w:type="dxa" w:w="115"/>
+              <w:bottom w:type="dxa" w:w="115"/>
+              <w:right w:type="dxa" w:w="115"/>
+            </w:tcMar>
+            <w:vAlign w:val="center"/>
+          </w:tcPr>
+          <w:p>
+            <w:pPr>
+              <w:spacing w:after="0" w:line="340"/>
+            </w:pPr>
+            <w:r>
+              <w:rPr>
+                <w:rFonts w:ascii="Arial" w:cs="Arial" w:eastAsia="Arial" w:hAnsi="Arial"/>
+                <w:color w:val="1D2021"/>
+                <w:sz w:val="20"/>
+                <w:szCs w:val="20"/>
+              </w:rPr>
+              <w:t xml:space="preserve">{$m.organization}</w:t>
+            </w:r>
+          </w:p>
+        </w:tc>
+        <w:tc>
+          <w:tcPr>
+            <w:tcBorders>
+              <w:top w:val="single" w:color="C7C7C7" w:sz="4"/>
+              <w:left w:val="nil" w:color="FFFFFF" w:sz="0"/>
+              <w:bottom w:val="single" w:color="C7C7C7" w:sz="4"/>
+              <w:right w:val="nil" w:color="FFFFFF" w:sz="0"/>
+            </w:tcBorders>
+            <w:tcMar>
+              <w:top w:type="dxa" w:w="115"/>
+              <w:left w:type="dxa" w:w="115"/>
+              <w:bottom w:type="dxa" w:w="115"/>
+              <w:right w:type="dxa" w:w="115"/>
+            </w:tcMar>
+            <w:vAlign w:val="center"/>
+          </w:tcPr>
+          <w:p>
+            <w:pPr>
+              <w:spacing w:after="0" w:line="340"/>
+            </w:pPr>
+            <w:r>
+              <w:rPr>
+                <w:rFonts w:ascii="Arial" w:cs="Arial" w:eastAsia="Arial" w:hAnsi="Arial"/>
+                <w:color w:val="1D2021"/>
+                <w:sz w:val="20"/>
+                <w:szCs w:val="20"/>
+              </w:rPr>
+              <w:t xml:space="preserve">{$m.role}</w:t>
+            </w:r>
+          </w:p>
+        </w:tc>
+        <w:tc>
+          <w:tcPr>
+            <w:tcBorders>
+              <w:top w:val="single" w:color="C7C7C7" w:sz="4"/>
+              <w:left w:val="nil" w:color="FFFFFF" w:sz="0"/>
+              <w:bottom w:val="single" w:color="C7C7C7" w:sz="4"/>
+              <w:right w:val="nil" w:color="FFFFFF" w:sz="0"/>
+            </w:tcBorders>
+            <w:tcMar>
+              <w:top w:type="dxa" w:w="115"/>
+              <w:left w:type="dxa" w:w="115"/>
+              <w:bottom w:type="dxa" w:w="115"/>
+              <w:right w:type="dxa" w:w="115"/>
+            </w:tcMar>
+            <w:vAlign w:val="center"/>
+          </w:tcPr>
+          <w:p>
+            <w:pPr>
+              <w:spacing w:after="0" w:line="340"/>
+            </w:pPr>
+            <w:r>
+              <w:rPr>
+                <w:rFonts w:ascii="Arial" w:cs="Arial" w:eastAsia="Arial" w:hAnsi="Arial"/>
+                <w:color w:val="1D2021"/>
+                <w:sz w:val="20"/>
+                <w:szCs w:val="20"/>
+              </w:rPr>
+              <w:t xml:space="preserve">{$m.email}</w:t>
+            </w:r>
+          </w:p>
+        </w:tc>
+      </w:tr>
+      <w:tr>
+        <w:trPr>
+          <w:trHeight w:val="0" w:hRule="atLeast"/>
+        </w:trPr>
+        <w:tc>
+          <w:tcPr>
+            <w:tcBorders>
+              <w:top w:val="single" w:color="C7C7C7" w:sz="4"/>
+              <w:left w:val="nil" w:color="FFFFFF" w:sz="0"/>
+              <w:bottom w:val="single" w:color="C7C7C7" w:sz="4"/>
+              <w:right w:val="nil" w:color="FFFFFF" w:sz="0"/>
+            </w:tcBorders>
+            <w:tcMar>
+              <w:top w:type="dxa" w:w="115"/>
+              <w:left w:type="dxa" w:w="115"/>
+              <w:bottom w:type="dxa" w:w="115"/>
+              <w:right w:type="dxa" w:w="115"/>
+            </w:tcMar>
+            <w:vAlign w:val="center"/>
+          </w:tcPr>
+          <w:p>
+            <w:pPr>
+              <w:spacing w:after="0" w:line="340"/>
+            </w:pPr>
+            <w:r>
+              <w:rPr>
+                <w:rFonts w:ascii="Arial" w:cs="Arial" w:eastAsia="Arial" w:hAnsi="Arial"/>
+                <w:color w:val="1D2021"/>
+                <w:sz w:val="2"/>
+                <w:szCs w:val="2"/>
+              </w:rPr>
+              <w:t xml:space="preserve">{END-FOR m}</w:t>
+            </w:r>
+          </w:p>
+        </w:tc>
+        <w:tc>
+          <w:tcPr>
+            <w:tcBorders>
+              <w:top w:val="single" w:color="C7C7C7" w:sz="4"/>
+              <w:left w:val="nil" w:color="FFFFFF" w:sz="0"/>
+              <w:bottom w:val="single" w:color="C7C7C7" w:sz="4"/>
+              <w:right w:val="nil" w:color="FFFFFF" w:sz="0"/>
+            </w:tcBorders>
+            <w:tcMar>
+              <w:top w:type="dxa" w:w="115"/>
+              <w:left w:type="dxa" w:w="115"/>
+              <w:bottom w:type="dxa" w:w="115"/>
+              <w:right w:type="dxa" w:w="115"/>
+            </w:tcMar>
+            <w:vAlign w:val="center"/>
+          </w:tcPr>
+          <w:p>
+            <w:pPr>
+              <w:spacing w:after="0" w:line="340"/>
+            </w:pPr>
+            <w:r>
+              <w:rPr>
+                <w:rFonts w:ascii="Arial" w:cs="Arial" w:eastAsia="Arial" w:hAnsi="Arial"/>
+                <w:sz w:val="2"/>
+                <w:szCs w:val="2"/>
+              </w:rPr>
+              <w:t xml:space="preserve"/>
+            </w:r>
+          </w:p>
+        </w:tc>
+        <w:tc>
+          <w:tcPr>
+            <w:tcBorders>
+              <w:top w:val="single" w:color="C7C7C7" w:sz="4"/>
+              <w:left w:val="nil" w:color="FFFFFF" w:sz="0"/>
+              <w:bottom w:val="single" w:color="C7C7C7" w:sz="4"/>
+              <w:right w:val="nil" w:color="FFFFFF" w:sz="0"/>
+            </w:tcBorders>
+            <w:tcMar>
+              <w:top w:type="dxa" w:w="115"/>
+              <w:left w:type="dxa" w:w="115"/>
+              <w:bottom w:type="dxa" w:w="115"/>
+              <w:right w:type="dxa" w:w="115"/>
+            </w:tcMar>
+            <w:vAlign w:val="center"/>
+          </w:tcPr>
+          <w:p>
+            <w:pPr>
+              <w:spacing w:after="0" w:line="340"/>
+            </w:pPr>
+            <w:r>
+              <w:rPr>
+                <w:rFonts w:ascii="Arial" w:cs="Arial" w:eastAsia="Arial" w:hAnsi="Arial"/>
+                <w:sz w:val="2"/>
+                <w:szCs w:val="2"/>
+              </w:rPr>
+              <w:t xml:space="preserve"/>
+            </w:r>
+          </w:p>
+        </w:tc>
+        <w:tc>
+          <w:tcPr>
+            <w:tcBorders>
+              <w:top w:val="single" w:color="C7C7C7" w:sz="4"/>
+              <w:left w:val="nil" w:color="FFFFFF" w:sz="0"/>
+              <w:bottom w:val="single" w:color="C7C7C7" w:sz="4"/>
+              <w:right w:val="nil" w:color="FFFFFF" w:sz="0"/>
+            </w:tcBorders>
+            <w:tcMar>
+              <w:top w:type="dxa" w:w="115"/>
+              <w:left w:type="dxa" w:w="115"/>
+              <w:bottom w:type="dxa" w:w="115"/>
+              <w:right w:type="dxa" w:w="115"/>
+            </w:tcMar>
+            <w:vAlign w:val="center"/>
+          </w:tcPr>
+          <w:p>
+            <w:pPr>
+              <w:spacing w:after="0" w:line="340"/>
+            </w:pPr>
+            <w:r>
+              <w:rPr>
+                <w:rFonts w:ascii="Arial" w:cs="Arial" w:eastAsia="Arial" w:hAnsi="Arial"/>
+                <w:sz w:val="2"/>
+                <w:szCs w:val="2"/>
+              </w:rPr>
+              <w:t xml:space="preserve"/>
+            </w:r>
+          </w:p>
+        </w:tc>
+      </w:tr>
+    </w:tbl>
     <w:sectPr>
+      <w:headerReference w:type="default" r:id="rId6"/>
+      <w:footerReference w:type="default" r:id="rId7"/>
       <w:pgSz w:w="11906" w:h="16838" w:orient="portrait"/>
-      <w:pgMar w:top="1440" w:right="1440" w:bottom="1440" w:left="1440" w:header="708" w:footer="708" w:gutter="0"/>
+      <w:pgMar w:top="936" w:right="1080" w:bottom="720" w:left="1080" w:header="360" w:footer="432" w:gutter="0"/>
       <w:pgNumType/>
       <w:docGrid w:linePitch="360"/>
     </w:sectPr>
@@ -48,6 +606,69 @@
 
 <file path=word/comments.xml><?xml version="1.0" encoding="utf-8"?>
 <w:comments xmlns:cx="http://schemas.microsoft.com/office/drawing/2014/chartex" xmlns:cx1="http://schemas.microsoft.com/office/drawing/2015/9/8/chartex" xmlns:cx2="http://schemas.microsoft.com/office/drawing/2015/10/21/chartex" xmlns:cx3="http://schemas.microsoft.com/office/drawing/2016/5/9/chartex" xmlns:cx4="http://schemas.microsoft.com/office/drawing/2016/5/10/chartex" xmlns:cx5="http://schemas.microsoft.com/office/drawing/2016/5/11/chartex" xmlns:cx6="http://schemas.microsoft.com/office/drawing/2016/5/12/chartex" xmlns:cx7="http://schemas.microsoft.com/office/drawing/2016/5/13/chartex" xmlns:cx8="http://schemas.microsoft.com/office/drawing/2016/5/14/chartex" xmlns:mc="http://schemas.openxmlformats.org/markup-compatibility/2006" xmlns:aink="http://schemas.microsoft.com/office/drawing/2016/ink" xmlns:am3d="http://schemas.microsoft.com/office/drawing/2017/model3d" xmlns:o="urn:schemas-microsoft-com:office:office" xmlns:r="http://schemas.openxmlformats.org/officeDocument/2006/relationships" xmlns:m="http://schemas.openxmlformats.org/officeDocument/2006/math" xmlns:v="urn:schemas-microsoft-com:vml" xmlns:wp14="http://schemas.microsoft.com/office/word/2010/wordprocessingDrawing" xmlns:wp="http://schemas.openxmlformats.org/drawingml/2006/wordprocessingDrawing" xmlns:w10="urn:schemas-microsoft-com:office:word" xmlns:w="http://schemas.openxmlformats.org/wordprocessingml/2006/main" xmlns:w14="http://schemas.microsoft.com/office/word/2010/wordml" xmlns:w15="http://schemas.microsoft.com/office/word/2012/wordml" xmlns:w16cex="http://schemas.microsoft.com/office/word/2018/wordml/cex" xmlns:w16cid="http://schemas.microsoft.com/office/word/2016/wordml/cid" xmlns:w16="http://schemas.microsoft.com/office/word/2018/wordml" xmlns:w16sdtdh="http://schemas.microsoft.com/office/word/2020/wordml/sdtdatahash" xmlns:w16se="http://schemas.microsoft.com/office/word/2015/wordml/symex" xmlns:wpg="http://schemas.microsoft.com/office/word/2010/wordprocessingGroup" xmlns:wpi="http://schemas.microsoft.com/office/word/2010/wordprocessingInk" xmlns:wne="http://schemas.microsoft.com/office/word/2006/wordml" xmlns:wps="http://schemas.microsoft.com/office/word/2010/wordprocessingShape"/>
+</file>
+
+<file path=word/footer1.xml><?xml version="1.0" encoding="utf-8"?>
+<w:ftr xmlns:wpc="http://schemas.microsoft.com/office/word/2010/wordprocessingCanvas" xmlns:mc="http://schemas.openxmlformats.org/markup-compatibility/2006" xmlns:o="urn:schemas-microsoft-com:office:office" xmlns:r="http://schemas.openxmlformats.org/officeDocument/2006/relationships" xmlns:m="http://schemas.openxmlformats.org/officeDocument/2006/math" xmlns:v="urn:schemas-microsoft-com:vml" xmlns:wp14="http://schemas.microsoft.com/office/word/2010/wordprocessingDrawing" xmlns:wp="http://schemas.openxmlformats.org/drawingml/2006/wordprocessingDrawing" xmlns:w10="urn:schemas-microsoft-com:office:word" xmlns:w="http://schemas.openxmlformats.org/wordprocessingml/2006/main" xmlns:w14="http://schemas.microsoft.com/office/word/2010/wordml" xmlns:w15="http://schemas.microsoft.com/office/word/2012/wordml" xmlns:wpg="http://schemas.microsoft.com/office/word/2010/wordprocessingGroup" xmlns:wpi="http://schemas.microsoft.com/office/word/2010/wordprocessingInk" xmlns:wne="http://schemas.microsoft.com/office/word/2006/wordml" xmlns:wps="http://schemas.microsoft.com/office/word/2010/wordprocessingShape">
+  <w:p>
+    <w:pPr>
+      <w:tabs>
+        <w:tab w:val="right" w:pos="9026"/>
+      </w:tabs>
+    </w:pPr>
+    <w:r>
+      <w:rPr>
+        <w:rFonts w:ascii="Arial" w:cs="Arial" w:eastAsia="Arial" w:hAnsi="Arial"/>
+        <w:color w:val="494A4B"/>
+        <w:sz w:val="13"/>
+        <w:szCs w:val="13"/>
+      </w:rPr>
+      <w:t xml:space="preserve">OpenAgreements Working Group List (v1.0). Free to use under CC0 1.0.</w:t>
+    </w:r>
+    <w:r>
+      <w:rPr>
+        <w:rFonts w:ascii="Arial" w:cs="Arial" w:eastAsia="Arial" w:hAnsi="Arial"/>
+        <w:color w:val="494A4B"/>
+        <w:sz w:val="13"/>
+        <w:szCs w:val="13"/>
+      </w:rPr>
+      <w:t xml:space="preserve">	Page </w:t>
+    </w:r>
+    <w:r>
+      <w:rPr>
+        <w:rFonts w:ascii="Arial" w:cs="Arial" w:eastAsia="Arial" w:hAnsi="Arial"/>
+        <w:color w:val="494A4B"/>
+        <w:sz w:val="13"/>
+        <w:szCs w:val="13"/>
+      </w:rPr>
+      <w:fldChar w:fldCharType="begin"/>
+      <w:instrText xml:space="preserve">PAGE</w:instrText>
+      <w:fldChar w:fldCharType="separate"/>
+      <w:fldChar w:fldCharType="end"/>
+    </w:r>
+    <w:r>
+      <w:rPr>
+        <w:rFonts w:ascii="Arial" w:cs="Arial" w:eastAsia="Arial" w:hAnsi="Arial"/>
+        <w:color w:val="494A4B"/>
+        <w:sz w:val="13"/>
+        <w:szCs w:val="13"/>
+      </w:rPr>
+      <w:t xml:space="preserve"> of </w:t>
+    </w:r>
+    <w:r>
+      <w:rPr>
+        <w:rFonts w:ascii="Arial" w:cs="Arial" w:eastAsia="Arial" w:hAnsi="Arial"/>
+        <w:color w:val="494A4B"/>
+        <w:sz w:val="13"/>
+        <w:szCs w:val="13"/>
+      </w:rPr>
+      <w:fldChar w:fldCharType="begin"/>
+      <w:instrText xml:space="preserve">NUMPAGES</w:instrText>
+      <w:fldChar w:fldCharType="separate"/>
+      <w:fldChar w:fldCharType="end"/>
+    </w:r>
+  </w:p>
+</w:ftr>
 </file>
 
 <file path=word/footnotes.xml><?xml version="1.0" encoding="utf-8"?>
@@ -87,6 +708,97 @@
 </w:footnotes>
 </file>
 
+<file path=word/header1.xml><?xml version="1.0" encoding="utf-8"?>
+<w:hdr xmlns:wpc="http://schemas.microsoft.com/office/word/2010/wordprocessingCanvas" xmlns:mc="http://schemas.openxmlformats.org/markup-compatibility/2006" xmlns:o="urn:schemas-microsoft-com:office:office" xmlns:r="http://schemas.openxmlformats.org/officeDocument/2006/relationships" xmlns:m="http://schemas.openxmlformats.org/officeDocument/2006/math" xmlns:v="urn:schemas-microsoft-com:vml" xmlns:wp14="http://schemas.microsoft.com/office/word/2010/wordprocessingDrawing" xmlns:wp="http://schemas.openxmlformats.org/drawingml/2006/wordprocessingDrawing" xmlns:w10="urn:schemas-microsoft-com:office:word" xmlns:w="http://schemas.openxmlformats.org/wordprocessingml/2006/main" xmlns:w14="http://schemas.microsoft.com/office/word/2010/wordml" xmlns:w15="http://schemas.microsoft.com/office/word/2012/wordml" xmlns:wpg="http://schemas.microsoft.com/office/word/2010/wordprocessingGroup" xmlns:wpi="http://schemas.microsoft.com/office/word/2010/wordprocessingInk" xmlns:wne="http://schemas.microsoft.com/office/word/2006/wordml" xmlns:wps="http://schemas.microsoft.com/office/word/2010/wordprocessingShape" xmlns:cx="http://schemas.microsoft.com/office/drawing/2014/chartex" xmlns:cx1="http://schemas.microsoft.com/office/drawing/2015/9/8/chartex" xmlns:cx2="http://schemas.microsoft.com/office/drawing/2015/10/21/chartex" xmlns:cx3="http://schemas.microsoft.com/office/drawing/2016/5/9/chartex" xmlns:cx4="http://schemas.microsoft.com/office/drawing/2016/5/10/chartex" xmlns:cx5="http://schemas.microsoft.com/office/drawing/2016/5/11/chartex" xmlns:cx6="http://schemas.microsoft.com/office/drawing/2016/5/12/chartex" xmlns:cx7="http://schemas.microsoft.com/office/drawing/2016/5/13/chartex" xmlns:cx8="http://schemas.microsoft.com/office/drawing/2016/5/14/chartex" xmlns:w16cid="http://schemas.microsoft.com/office/word/2016/wordml/cid" xmlns:w16se="http://schemas.microsoft.com/office/word/2015/wordml/symex">
+  <w:tbl>
+    <w:tblPr>
+      <w:tblW w:type="dxa" w:w="10070"/>
+      <w:tblBorders>
+        <w:top w:val="single" w:color="107087" w:sz="14"/>
+        <w:left w:val="nil" w:color="FFFFFF" w:sz="0"/>
+        <w:bottom w:val="nil" w:color="FFFFFF" w:sz="0"/>
+        <w:right w:val="nil" w:color="FFFFFF" w:sz="0"/>
+        <w:insideH w:val="single" w:color="auto" w:sz="4"/>
+        <w:insideV w:val="single" w:color="auto" w:sz="4"/>
+      </w:tblBorders>
+      <w:tblLayout w:type="fixed"/>
+    </w:tblPr>
+    <w:tblGrid>
+      <w:gridCol w:w="7900"/>
+      <w:gridCol w:w="2170"/>
+    </w:tblGrid>
+    <w:tr>
+      <w:trPr>
+        <w:trHeight w:val="360" w:hRule="atLeast"/>
+      </w:trPr>
+      <w:tc>
+        <w:tcPr>
+          <w:tcBorders>
+            <w:top w:val="nil" w:color="FFFFFF" w:sz="0"/>
+            <w:left w:val="nil" w:color="FFFFFF" w:sz="0"/>
+            <w:bottom w:val="nil" w:color="FFFFFF" w:sz="0"/>
+            <w:right w:val="nil" w:color="FFFFFF" w:sz="0"/>
+          </w:tcBorders>
+          <w:tcMar>
+            <w:top w:type="dxa" w:w="36"/>
+            <w:left w:type="dxa" w:w="0"/>
+            <w:bottom w:type="dxa" w:w="0"/>
+            <w:right w:type="dxa" w:w="0"/>
+          </w:tcMar>
+        </w:tcPr>
+        <w:p>
+          <w:r>
+            <w:t xml:space="preserve"/>
+          </w:r>
+        </w:p>
+      </w:tc>
+      <w:tc>
+        <w:tcPr>
+          <w:tcBorders>
+            <w:top w:val="nil" w:color="FFFFFF" w:sz="0"/>
+            <w:left w:val="nil" w:color="FFFFFF" w:sz="0"/>
+            <w:bottom w:val="nil" w:color="FFFFFF" w:sz="0"/>
+            <w:right w:val="nil" w:color="FFFFFF" w:sz="0"/>
+          </w:tcBorders>
+          <w:tcMar>
+            <w:top w:type="dxa" w:w="36"/>
+            <w:left w:type="dxa" w:w="0"/>
+            <w:bottom w:type="dxa" w:w="0"/>
+            <w:right w:type="dxa" w:w="0"/>
+          </w:tcMar>
+          <w:vAlign w:val="center"/>
+        </w:tcPr>
+        <w:p>
+          <w:pPr>
+            <w:spacing w:before="0" w:after="0"/>
+            <w:jc w:val="right"/>
+          </w:pPr>
+          <w:r>
+            <w:rPr>
+              <w:rFonts w:ascii="Arial" w:cs="Arial" w:eastAsia="Arial" w:hAnsi="Arial"/>
+              <w:b/>
+              <w:bCs/>
+              <w:color w:val="107087"/>
+              <w:sz w:val="18"/>
+              <w:szCs w:val="18"/>
+            </w:rPr>
+            <w:t xml:space="preserve">WORKING GROUP LIST</w:t>
+          </w:r>
+        </w:p>
+      </w:tc>
+    </w:tr>
+  </w:tbl>
+  <w:p>
+    <w:pPr>
+      <w:spacing w:after="60"/>
+    </w:pPr>
+    <w:r>
+      <w:t xml:space="preserve"/>
+    </w:r>
+  </w:p>
+</w:hdr>
+</file>
+
 <file path=word/numbering.xml><?xml version="1.0" encoding="utf-8"?>
 <w:numbering xmlns:wpc="http://schemas.microsoft.com/office/word/2010/wordprocessingCanvas" xmlns:mc="http://schemas.openxmlformats.org/markup-compatibility/2006" xmlns:o="urn:schemas-microsoft-com:office:office" xmlns:r="http://schemas.openxmlformats.org/officeDocument/2006/relationships" xmlns:m="http://schemas.openxmlformats.org/officeDocument/2006/math" xmlns:v="urn:schemas-microsoft-com:vml" xmlns:wp14="http://schemas.microsoft.com/office/word/2010/wordprocessingDrawing" xmlns:wp="http://schemas.openxmlformats.org/drawingml/2006/wordprocessingDrawing" xmlns:w10="urn:schemas-microsoft-com:office:word" xmlns:w="http://schemas.openxmlformats.org/wordprocessingml/2006/main" xmlns:w14="http://schemas.microsoft.com/office/word/2010/wordml" xmlns:w15="http://schemas.microsoft.com/office/word/2012/wordml" xmlns:wpg="http://schemas.microsoft.com/office/word/2010/wordprocessingGroup" xmlns:wpi="http://schemas.microsoft.com/office/word/2010/wordprocessingInk" xmlns:wne="http://schemas.microsoft.com/office/word/2006/wordml" xmlns:wps="http://schemas.microsoft.com/office/word/2010/wordprocessingShape" mc:Ignorable="w14 w15 wp14">
   <w:abstractNum w:abstractNumId="1" w15:restartNumberingAfterBreak="0">
@@ -185,8 +897,19 @@
 <file path=word/styles.xml><?xml version="1.0" encoding="utf-8"?>
 <w:styles xmlns:mc="http://schemas.openxmlformats.org/markup-compatibility/2006" xmlns:r="http://schemas.openxmlformats.org/officeDocument/2006/relationships" xmlns:w="http://schemas.openxmlformats.org/wordprocessingml/2006/main" xmlns:w14="http://schemas.microsoft.com/office/word/2010/wordml" xmlns:w15="http://schemas.microsoft.com/office/word/2012/wordml" mc:Ignorable="w14 w15">
   <w:docDefaults>
-    <w:rPrDefault/>
-    <w:pPrDefault/>
+    <w:rPrDefault>
+      <w:rPr>
+        <w:rFonts w:ascii="Arial" w:cs="Arial" w:eastAsia="Arial" w:hAnsi="Arial"/>
+        <w:color w:val="1D2021"/>
+        <w:sz w:val="22"/>
+        <w:szCs w:val="22"/>
+      </w:rPr>
+    </w:rPrDefault>
+    <w:pPrDefault>
+      <w:pPr>
+        <w:spacing w:before="0" w:after="0" w:line="340" w:lineRule="auto"/>
+      </w:pPr>
+    </w:pPrDefault>
   </w:docDefaults>
   <w:style w:type="paragraph" w:styleId="Title">
     <w:name w:val="Title"/>
@@ -322,5 +1045,19 @@
       <w:szCs w:val="20"/>
     </w:rPr>
   </w:style>
+  <w:style w:type="paragraph" w:styleId="Normal">
+    <w:name w:val="Normal"/>
+    <w:next w:val="Normal"/>
+    <w:qFormat/>
+    <w:pPr>
+      <w:spacing w:before="0" w:after="0" w:line="340" w:lineRule="auto"/>
+    </w:pPr>
+    <w:rPr>
+      <w:rFonts w:ascii="Arial" w:cs="Arial" w:eastAsia="Arial" w:hAnsi="Arial"/>
+      <w:color w:val="1D2021"/>
+      <w:sz w:val="22"/>
+      <w:szCs w:val="22"/>
+    </w:rPr>
+  </w:style>
 </w:styles>
 </file>
</xml_diff>